<commit_message>
Switch rate limiting from daily to monthly (MONTHLY_LIMIT=3)
- DAILY_LIMIT → MONTHLY_LIMIT = 3 across all 11 tools + _template.html
- RATE_KEY date suffix: YYYY-MM-DD → YYYY-MM (auto-resets each month)
- Error message: 'Aylık kullanım limitinize ulaştınız. [NextMonth] ayında tekrar deneyin.'
- TR_MONTHS array + nextMonthName() helper added to every tool
- whatsapp: getTodayStr() → getThisMonthStr() with slice(0,7)
- UI labels: 'Günlük kullanım' → 'Aylık kullanım' everywhere
- kolay_kobi_gelistirme_rehberi_v3.html: rate limit section rewritten for monthly
- kobikolayUygulamalar.docx: updated rate limiting pattern documentation

Co-Authored-By: Claude Sonnet 4.6 <noreply@anthropic.com>
Claude-Session: https://claude.ai/code/session_01PAqFQrFbxfjaT72rpNtL52
</commit_message>
<xml_diff>
--- a/kobikolayUygulamalar.docx
+++ b/kobikolayUygulamalar.docx
@@ -1256,7 +1256,7 @@
         <w:spacing w:after="60"/>
       </w:pPr>
       <w:r>
-        <w:t xml:space="preserve">Rate bar — günlük kullanım çubuğu (DAILY_LIMIT: 3)</w:t>
+        <w:t xml:space="preserve">Rate bar — aylık kullanım çubuğu (MONTHLY_LIMIT: 3, YYYY-MM key ile her ay sıfırlanır)</w:t>
       </w:r>
     </w:p>
     <w:p>
@@ -8579,7 +8579,7 @@
         <w:spacing w:after="80" w:before="240"/>
       </w:pPr>
       <w:r>
-        <w:t xml:space="preserve">3.1 Rate Limiting — Standart Pattern</w:t>
+        <w:t xml:space="preserve">3.1 Rate Limiting — Aylık Pattern</w:t>
       </w:r>
     </w:p>
     <w:p>
@@ -8602,39 +8602,55 @@
           <w:sz w:val="170"/>
           <w:szCs w:val="170"/>
         </w:rPr>
-        <w:t xml:space="preserve">const DAILY_LIMIT = 3;</w:t>
-      </w:r>
-    </w:p>
-    <w:p>
-      <w:pPr>
-        <w:shd w:fill="1E293B" w:val="clear"/>
-        <w:spacing w:after="0"/>
-        <w:ind w:left="210" w:right="210"/>
-      </w:pPr>
-      <w:r>
-        <w:rPr>
-          <w:rFonts w:ascii="Courier New" w:cs="Courier New" w:eastAsia="Courier New" w:hAnsi="Courier New"/>
-          <w:color w:val="E2E8F0"/>
-          <w:sz w:val="170"/>
-          <w:szCs w:val="170"/>
-        </w:rPr>
-        <w:t xml:space="preserve">const today = new Date().toISOString().slice(0,10); // "2026-08-06"</w:t>
-      </w:r>
-    </w:p>
-    <w:p>
-      <w:pPr>
-        <w:shd w:fill="1E293B" w:val="clear"/>
-        <w:spacing w:after="0"/>
-        <w:ind w:left="210" w:right="210"/>
-      </w:pPr>
-      <w:r>
-        <w:rPr>
-          <w:rFonts w:ascii="Courier New" w:cs="Courier New" w:eastAsia="Courier New" w:hAnsi="Courier New"/>
-          <w:color w:val="E2E8F0"/>
-          <w:sz w:val="170"/>
-          <w:szCs w:val="170"/>
-        </w:rPr>
-        <w:t xml:space="preserve">const RATE_KEY = 'kkb_arac_usage_' + today; // tarih suffix ZORUNLU</w:t>
+        <w:t xml:space="preserve">const MONTHLY_LIMIT = 3;</w:t>
+      </w:r>
+    </w:p>
+    <w:p>
+      <w:pPr>
+        <w:shd w:fill="1E293B" w:val="clear"/>
+        <w:spacing w:after="0"/>
+        <w:ind w:left="210" w:right="210"/>
+      </w:pPr>
+      <w:r>
+        <w:rPr>
+          <w:rFonts w:ascii="Courier New" w:cs="Courier New" w:eastAsia="Courier New" w:hAnsi="Courier New"/>
+          <w:color w:val="E2E8F0"/>
+          <w:sz w:val="170"/>
+          <w:szCs w:val="170"/>
+        </w:rPr>
+        <w:t xml:space="preserve">const TR_MONTHS = ['Ocak','Şubat','Mart','Nisan','Mayıs','Haziran','Temmuz','Ağustos','Eylül','Ekim','Kasım','Aralık'];</w:t>
+      </w:r>
+    </w:p>
+    <w:p>
+      <w:pPr>
+        <w:shd w:fill="1E293B" w:val="clear"/>
+        <w:spacing w:after="0"/>
+        <w:ind w:left="210" w:right="210"/>
+      </w:pPr>
+      <w:r>
+        <w:rPr>
+          <w:rFonts w:ascii="Courier New" w:cs="Courier New" w:eastAsia="Courier New" w:hAnsi="Courier New"/>
+          <w:color w:val="E2E8F0"/>
+          <w:sz w:val="170"/>
+          <w:szCs w:val="170"/>
+        </w:rPr>
+        <w:t xml:space="preserve">function nextMonthName() { return TR_MONTHS[(new Date().getMonth()+1)%12]; }</w:t>
+      </w:r>
+    </w:p>
+    <w:p>
+      <w:pPr>
+        <w:shd w:fill="1E293B" w:val="clear"/>
+        <w:spacing w:after="0"/>
+        <w:ind w:left="210" w:right="210"/>
+      </w:pPr>
+      <w:r>
+        <w:rPr>
+          <w:rFonts w:ascii="Courier New" w:cs="Courier New" w:eastAsia="Courier New" w:hAnsi="Courier New"/>
+          <w:color w:val="E2E8F0"/>
+          <w:sz w:val="170"/>
+          <w:szCs w:val="170"/>
+        </w:rPr>
+        <w:t xml:space="preserve">const RATE_KEY = 'kkb_arac_usage_' + new Date().toISOString().slice(0,7); // "2026-08" — ay suffix ZORUNLU</w:t>
       </w:r>
     </w:p>
     <w:p>
@@ -8682,7 +8698,55 @@
           <w:sz w:val="170"/>
           <w:szCs w:val="170"/>
         </w:rPr>
-        <w:t xml:space="preserve">  return parseInt(localStorage.getItem(RATE_KEY)||'0') &lt; DAILY_LIMIT;</w:t>
+        <w:t xml:space="preserve">  const d = JSON.parse(localStorage.getItem(RATE_KEY)||'{}')</w:t>
+      </w:r>
+    </w:p>
+    <w:p>
+      <w:pPr>
+        <w:shd w:fill="1E293B" w:val="clear"/>
+        <w:spacing w:after="0"/>
+        <w:ind w:left="210" w:right="210"/>
+      </w:pPr>
+      <w:r>
+        <w:rPr>
+          <w:rFonts w:ascii="Courier New" w:cs="Courier New" w:eastAsia="Courier New" w:hAnsi="Courier New"/>
+          <w:color w:val="E2E8F0"/>
+          <w:sz w:val="170"/>
+          <w:szCs w:val="170"/>
+        </w:rPr>
+        <w:t xml:space="preserve">  const month = new Date().toISOString().slice(0,7);</w:t>
+      </w:r>
+    </w:p>
+    <w:p>
+      <w:pPr>
+        <w:shd w:fill="1E293B" w:val="clear"/>
+        <w:spacing w:after="0"/>
+        <w:ind w:left="210" w:right="210"/>
+      </w:pPr>
+      <w:r>
+        <w:rPr>
+          <w:rFonts w:ascii="Courier New" w:cs="Courier New" w:eastAsia="Courier New" w:hAnsi="Courier New"/>
+          <w:color w:val="E2E8F0"/>
+          <w:sz w:val="170"/>
+          <w:szCs w:val="170"/>
+        </w:rPr>
+        <w:t xml:space="preserve">  if (d.date !== month) return true;</w:t>
+      </w:r>
+    </w:p>
+    <w:p>
+      <w:pPr>
+        <w:shd w:fill="1E293B" w:val="clear"/>
+        <w:spacing w:after="0"/>
+        <w:ind w:left="210" w:right="210"/>
+      </w:pPr>
+      <w:r>
+        <w:rPr>
+          <w:rFonts w:ascii="Courier New" w:cs="Courier New" w:eastAsia="Courier New" w:hAnsi="Courier New"/>
+          <w:color w:val="E2E8F0"/>
+          <w:sz w:val="170"/>
+          <w:szCs w:val="170"/>
+        </w:rPr>
+        <w:t xml:space="preserve">  return (d.count||0) &lt; MONTHLY_LIMIT;</w:t>
       </w:r>
     </w:p>
     <w:p>
@@ -8730,23 +8794,55 @@
           <w:sz w:val="170"/>
           <w:szCs w:val="170"/>
         </w:rPr>
-        <w:t xml:space="preserve">  const used = parseInt(localStorage.getItem(RATE_KEY)||'0');</w:t>
-      </w:r>
-    </w:p>
-    <w:p>
-      <w:pPr>
-        <w:shd w:fill="1E293B" w:val="clear"/>
-        <w:spacing w:after="0"/>
-        <w:ind w:left="210" w:right="210"/>
-      </w:pPr>
-      <w:r>
-        <w:rPr>
-          <w:rFonts w:ascii="Courier New" w:cs="Courier New" w:eastAsia="Courier New" w:hAnsi="Courier New"/>
-          <w:color w:val="E2E8F0"/>
-          <w:sz w:val="170"/>
-          <w:szCs w:val="170"/>
-        </w:rPr>
-        <w:t xml:space="preserve">  localStorage.setItem(RATE_KEY, used+1);</w:t>
+        <w:t xml:space="preserve">  const d = JSON.parse(localStorage.getItem(RATE_KEY)||'{}')</w:t>
+      </w:r>
+    </w:p>
+    <w:p>
+      <w:pPr>
+        <w:shd w:fill="1E293B" w:val="clear"/>
+        <w:spacing w:after="0"/>
+        <w:ind w:left="210" w:right="210"/>
+      </w:pPr>
+      <w:r>
+        <w:rPr>
+          <w:rFonts w:ascii="Courier New" w:cs="Courier New" w:eastAsia="Courier New" w:hAnsi="Courier New"/>
+          <w:color w:val="E2E8F0"/>
+          <w:sz w:val="170"/>
+          <w:szCs w:val="170"/>
+        </w:rPr>
+        <w:t xml:space="preserve">  const month = new Date().toISOString().slice(0,7);</w:t>
+      </w:r>
+    </w:p>
+    <w:p>
+      <w:pPr>
+        <w:shd w:fill="1E293B" w:val="clear"/>
+        <w:spacing w:after="0"/>
+        <w:ind w:left="210" w:right="210"/>
+      </w:pPr>
+      <w:r>
+        <w:rPr>
+          <w:rFonts w:ascii="Courier New" w:cs="Courier New" w:eastAsia="Courier New" w:hAnsi="Courier New"/>
+          <w:color w:val="E2E8F0"/>
+          <w:sz w:val="170"/>
+          <w:szCs w:val="170"/>
+        </w:rPr>
+        <w:t xml:space="preserve">  const count = (d.date===month) ? (d.count||0) : 0;</w:t>
+      </w:r>
+    </w:p>
+    <w:p>
+      <w:pPr>
+        <w:shd w:fill="1E293B" w:val="clear"/>
+        <w:spacing w:after="0"/>
+        <w:ind w:left="210" w:right="210"/>
+      </w:pPr>
+      <w:r>
+        <w:rPr>
+          <w:rFonts w:ascii="Courier New" w:cs="Courier New" w:eastAsia="Courier New" w:hAnsi="Courier New"/>
+          <w:color w:val="E2E8F0"/>
+          <w:sz w:val="170"/>
+          <w:szCs w:val="170"/>
+        </w:rPr>
+        <w:t xml:space="preserve">  localStorage.setItem(RATE_KEY, JSON.stringify({date:month,count:count+1}));</w:t>
       </w:r>
     </w:p>
     <w:p>
@@ -8794,71 +8890,7 @@
           <w:sz w:val="170"/>
           <w:szCs w:val="170"/>
         </w:rPr>
-        <w:t xml:space="preserve">function updateRateBar() {</w:t>
-      </w:r>
-    </w:p>
-    <w:p>
-      <w:pPr>
-        <w:shd w:fill="1E293B" w:val="clear"/>
-        <w:spacing w:after="0"/>
-        <w:ind w:left="210" w:right="210"/>
-      </w:pPr>
-      <w:r>
-        <w:rPr>
-          <w:rFonts w:ascii="Courier New" w:cs="Courier New" w:eastAsia="Courier New" w:hAnsi="Courier New"/>
-          <w:color w:val="E2E8F0"/>
-          <w:sz w:val="170"/>
-          <w:szCs w:val="170"/>
-        </w:rPr>
-        <w:t xml:space="preserve">  const used = parseInt(localStorage.getItem(RATE_KEY)||'0');</w:t>
-      </w:r>
-    </w:p>
-    <w:p>
-      <w:pPr>
-        <w:shd w:fill="1E293B" w:val="clear"/>
-        <w:spacing w:after="0"/>
-        <w:ind w:left="210" w:right="210"/>
-      </w:pPr>
-      <w:r>
-        <w:rPr>
-          <w:rFonts w:ascii="Courier New" w:cs="Courier New" w:eastAsia="Courier New" w:hAnsi="Courier New"/>
-          <w:color w:val="E2E8F0"/>
-          <w:sz w:val="170"/>
-          <w:szCs w:val="170"/>
-        </w:rPr>
-        <w:t xml:space="preserve">  document.getElementById('rate-fill').style.width = Math.min(100,(used/DAILY_LIMIT)*100)+'%';</w:t>
-      </w:r>
-    </w:p>
-    <w:p>
-      <w:pPr>
-        <w:shd w:fill="1E293B" w:val="clear"/>
-        <w:spacing w:after="0"/>
-        <w:ind w:left="210" w:right="210"/>
-      </w:pPr>
-      <w:r>
-        <w:rPr>
-          <w:rFonts w:ascii="Courier New" w:cs="Courier New" w:eastAsia="Courier New" w:hAnsi="Courier New"/>
-          <w:color w:val="E2E8F0"/>
-          <w:sz w:val="170"/>
-          <w:szCs w:val="170"/>
-        </w:rPr>
-        <w:t xml:space="preserve">  document.getElementById('rate-text').textContent = used+'/'+DAILY_LIMIT+' kullanım';</w:t>
-      </w:r>
-    </w:p>
-    <w:p>
-      <w:pPr>
-        <w:shd w:fill="1E293B" w:val="clear"/>
-        <w:spacing w:after="0"/>
-        <w:ind w:left="210" w:right="210"/>
-      </w:pPr>
-      <w:r>
-        <w:rPr>
-          <w:rFonts w:ascii="Courier New" w:cs="Courier New" w:eastAsia="Courier New" w:hAnsi="Courier New"/>
-          <w:color w:val="E2E8F0"/>
-          <w:sz w:val="170"/>
-          <w:szCs w:val="170"/>
-        </w:rPr>
-        <w:t xml:space="preserve">}</w:t>
+        <w:t xml:space="preserve">// Hata: 'Aylık kullanım limitinize ulaştınız. ' + nextMonthName() + ' ayında tekrar deneyin.'</w:t>
       </w:r>
     </w:p>
     <w:p>

</xml_diff>